<commit_message>
corrected H0/H1 & p-value
</commit_message>
<xml_diff>
--- a/Практическая работа 6.docx
+++ b/Практическая работа 6.docx
@@ -433,14 +433,56 @@
           <w:color w:val="000000"/>
         </w:rPr>
         <w:lastRenderedPageBreak/>
-        <w:t xml:space="preserve">Цель работы: </w:t>
+        <w:t>Цель работы</w:t>
+      </w:r>
+      <w:proofErr w:type="gramStart"/>
+      <w:r>
+        <w:rPr>
+          <w:color w:val="000000"/>
+        </w:rPr>
+        <w:t xml:space="preserve">: </w:t>
       </w:r>
       <w:bookmarkStart w:id="0" w:name="_Hlk182513992"/>
       <w:r>
         <w:rPr>
           <w:color w:val="000000"/>
         </w:rPr>
-        <w:t>Провести AB-тестирование. По результату расчета значения p-value и построения распределения конверсии, используя бутстрап-метод, сделать вывод – являются ли результаты тестируемой группы (группа B – новый магазин) статистически лучше, или же это произошло случайно? Имеет ли смысл полностью обновлять дизайн или лучше оставить старый?</w:t>
+        <w:t>Провести</w:t>
+      </w:r>
+      <w:proofErr w:type="gramEnd"/>
+      <w:r>
+        <w:rPr>
+          <w:color w:val="000000"/>
+        </w:rPr>
+        <w:t xml:space="preserve"> AB-тестирование. По результату расчета значения p-</w:t>
+      </w:r>
+      <w:proofErr w:type="spellStart"/>
+      <w:r>
+        <w:rPr>
+          <w:color w:val="000000"/>
+        </w:rPr>
+        <w:t>value</w:t>
+      </w:r>
+      <w:proofErr w:type="spellEnd"/>
+      <w:r>
+        <w:rPr>
+          <w:color w:val="000000"/>
+        </w:rPr>
+        <w:t xml:space="preserve"> и построения распределения конверсии, используя </w:t>
+      </w:r>
+      <w:proofErr w:type="spellStart"/>
+      <w:r>
+        <w:rPr>
+          <w:color w:val="000000"/>
+        </w:rPr>
+        <w:t>бутстрап</w:t>
+      </w:r>
+      <w:proofErr w:type="spellEnd"/>
+      <w:r>
+        <w:rPr>
+          <w:color w:val="000000"/>
+        </w:rPr>
+        <w:t>-метод, сделать вывод – являются ли результаты тестируемой группы (группа B – новый магазин) статистически лучше, или же это произошло случайно? Имеет ли смысл полностью обновлять дизайн или лучше оставить старый?</w:t>
       </w:r>
     </w:p>
     <w:bookmarkEnd w:id="0"/>
@@ -469,7 +511,21 @@
         <w:rPr>
           <w:color w:val="000000"/>
         </w:rPr>
-        <w:t>Распределим датасеты (21.03.2025) по переменным</w:t>
+        <w:t xml:space="preserve">Распределим </w:t>
+      </w:r>
+      <w:proofErr w:type="spellStart"/>
+      <w:r>
+        <w:rPr>
+          <w:color w:val="000000"/>
+        </w:rPr>
+        <w:t>датасеты</w:t>
+      </w:r>
+      <w:proofErr w:type="spellEnd"/>
+      <w:r>
+        <w:rPr>
+          <w:color w:val="000000"/>
+        </w:rPr>
+        <w:t xml:space="preserve"> (21.03.2025) по переменным</w:t>
       </w:r>
       <w:r>
         <w:rPr>
@@ -481,7 +537,35 @@
         <w:rPr>
           <w:color w:val="000000"/>
         </w:rPr>
-        <w:t xml:space="preserve"> Потом удалим дубликаты из датафреймов если они там есть. Добавим к датафреймам с </w:t>
+        <w:t xml:space="preserve"> Потом удалим дубликаты из </w:t>
+      </w:r>
+      <w:proofErr w:type="spellStart"/>
+      <w:r>
+        <w:rPr>
+          <w:color w:val="000000"/>
+        </w:rPr>
+        <w:t>датафреймов</w:t>
+      </w:r>
+      <w:proofErr w:type="spellEnd"/>
+      <w:r>
+        <w:rPr>
+          <w:color w:val="000000"/>
+        </w:rPr>
+        <w:t xml:space="preserve"> если они там есть. Добавим к </w:t>
+      </w:r>
+      <w:proofErr w:type="spellStart"/>
+      <w:r>
+        <w:rPr>
+          <w:color w:val="000000"/>
+        </w:rPr>
+        <w:t>датафреймам</w:t>
+      </w:r>
+      <w:proofErr w:type="spellEnd"/>
+      <w:r>
+        <w:rPr>
+          <w:color w:val="000000"/>
+        </w:rPr>
+        <w:t xml:space="preserve"> с </w:t>
       </w:r>
       <w:r>
         <w:rPr>
@@ -500,7 +584,21 @@
         <w:rPr>
           <w:color w:val="000000"/>
         </w:rPr>
-        <w:t>столбец с буквой. После чего сольем старые датафреймы с новым.</w:t>
+        <w:t xml:space="preserve">столбец с буквой. После чего сольем старые </w:t>
+      </w:r>
+      <w:proofErr w:type="spellStart"/>
+      <w:r>
+        <w:rPr>
+          <w:color w:val="000000"/>
+        </w:rPr>
+        <w:t>датафреймы</w:t>
+      </w:r>
+      <w:proofErr w:type="spellEnd"/>
+      <w:r>
+        <w:rPr>
+          <w:color w:val="000000"/>
+        </w:rPr>
+        <w:t xml:space="preserve"> с новым.</w:t>
       </w:r>
     </w:p>
     <w:p>
@@ -592,8 +690,13 @@
         <w:t xml:space="preserve"> </w:t>
       </w:r>
       <w:r>
-        <w:t>Подготовим датасеты</w:t>
-      </w:r>
+        <w:t xml:space="preserve">Подготовим </w:t>
+      </w:r>
+      <w:proofErr w:type="spellStart"/>
+      <w:r>
+        <w:t>датасеты</w:t>
+      </w:r>
+      <w:proofErr w:type="spellEnd"/>
       <w:r>
         <w:t>.</w:t>
       </w:r>
@@ -605,6 +708,7 @@
       <w:r>
         <w:t xml:space="preserve">Вычислим конверсию в покупку по типу устройств сначала для </w:t>
       </w:r>
+      <w:proofErr w:type="gramStart"/>
       <w:r>
         <w:rPr>
           <w:lang w:val="en-US"/>
@@ -615,7 +719,11 @@
         <w:t xml:space="preserve">,  </w:t>
       </w:r>
       <w:r>
-        <w:t xml:space="preserve">а потом для </w:t>
+        <w:t>а</w:t>
+      </w:r>
+      <w:proofErr w:type="gramEnd"/>
+      <w:r>
+        <w:t xml:space="preserve"> потом для </w:t>
       </w:r>
       <w:r>
         <w:rPr>
@@ -759,7 +867,7 @@
           <w:lang w:val="en-US"/>
         </w:rPr>
         <w:drawing>
-          <wp:inline distT="0" distB="0" distL="0" distR="0" wp14:anchorId="2E4F98C1" wp14:editId="12694F5D">
+          <wp:inline distT="0" distB="0" distL="0" distR="0" wp14:anchorId="2E4F98C1" wp14:editId="19A92868">
             <wp:extent cx="5859273" cy="3233541"/>
             <wp:effectExtent l="19050" t="19050" r="27305" b="24130"/>
             <wp:docPr id="1730749767" name="Рисунок 1"/>
@@ -788,7 +896,7 @@
                   <pic:spPr>
                     <a:xfrm>
                       <a:off x="0" y="0"/>
-                      <a:ext cx="5884217" cy="3247307"/>
+                      <a:ext cx="5859273" cy="3233541"/>
                     </a:xfrm>
                     <a:prstGeom prst="rect">
                       <a:avLst/>
@@ -838,7 +946,15 @@
         <w:spacing w:after="0"/>
       </w:pPr>
       <w:r>
-        <w:t>Создадим бутстрап метод</w:t>
+        <w:t xml:space="preserve">Создадим </w:t>
+      </w:r>
+      <w:proofErr w:type="spellStart"/>
+      <w:r>
+        <w:t>бутстрап</w:t>
+      </w:r>
+      <w:proofErr w:type="spellEnd"/>
+      <w:r>
+        <w:t xml:space="preserve"> метод</w:t>
       </w:r>
       <w:r>
         <w:t xml:space="preserve">, </w:t>
@@ -936,8 +1052,13 @@
       <w:r>
         <w:t xml:space="preserve"> </w:t>
       </w:r>
-      <w:r>
-        <w:t>Бутстрап метод</w:t>
+      <w:proofErr w:type="spellStart"/>
+      <w:r>
+        <w:t>Бутстрап</w:t>
+      </w:r>
+      <w:proofErr w:type="spellEnd"/>
+      <w:r>
+        <w:t xml:space="preserve"> метод</w:t>
       </w:r>
       <w:r>
         <w:t>.</w:t>
@@ -977,12 +1098,14 @@
       <w:r>
         <w:t xml:space="preserve">через </w:t>
       </w:r>
+      <w:proofErr w:type="spellStart"/>
       <w:r>
         <w:rPr>
           <w:lang w:val="en-US"/>
         </w:rPr>
         <w:t>ttest</w:t>
       </w:r>
+      <w:proofErr w:type="spellEnd"/>
       <w:r>
         <w:t>.</w:t>
       </w:r>
@@ -1108,7 +1231,15 @@
       </w:pPr>
       <w:r>
         <w:lastRenderedPageBreak/>
-        <w:t>Создадим бутстрап метод и построим график распределения среднего чека.</w:t>
+        <w:t xml:space="preserve">Создадим </w:t>
+      </w:r>
+      <w:proofErr w:type="spellStart"/>
+      <w:r>
+        <w:t>бутстрап</w:t>
+      </w:r>
+      <w:proofErr w:type="spellEnd"/>
+      <w:r>
+        <w:t xml:space="preserve"> метод и построим график распределения среднего чека.</w:t>
       </w:r>
     </w:p>
     <w:p>
@@ -1219,8 +1350,13 @@
       <w:r>
         <w:t xml:space="preserve"> </w:t>
       </w:r>
-      <w:r>
-        <w:t>Бутстрап метод</w:t>
+      <w:proofErr w:type="spellStart"/>
+      <w:r>
+        <w:t>Бутстрап</w:t>
+      </w:r>
+      <w:proofErr w:type="spellEnd"/>
+      <w:r>
+        <w:t xml:space="preserve"> метод</w:t>
       </w:r>
       <w:r>
         <w:t>.</w:t>
@@ -1444,8 +1580,13 @@
       <w:r>
         <w:t xml:space="preserve"> </w:t>
       </w:r>
-      <w:r>
-        <w:t>Бутстрап метод</w:t>
+      <w:proofErr w:type="spellStart"/>
+      <w:r>
+        <w:t>Бутстрап</w:t>
+      </w:r>
+      <w:proofErr w:type="spellEnd"/>
+      <w:r>
+        <w:t xml:space="preserve"> метод</w:t>
       </w:r>
       <w:r>
         <w:t>.</w:t>
@@ -1879,8 +2020,13 @@
       <w:r>
         <w:t xml:space="preserve"> </w:t>
       </w:r>
-      <w:r>
-        <w:t>Бутстрап метод</w:t>
+      <w:proofErr w:type="spellStart"/>
+      <w:r>
+        <w:t>Бутстрап</w:t>
+      </w:r>
+      <w:proofErr w:type="spellEnd"/>
+      <w:r>
+        <w:t xml:space="preserve"> метод</w:t>
       </w:r>
       <w:r>
         <w:t>.</w:t>
@@ -2107,8 +2253,13 @@
       <w:r>
         <w:t xml:space="preserve"> </w:t>
       </w:r>
-      <w:r>
-        <w:t>Бутстрап метод</w:t>
+      <w:proofErr w:type="spellStart"/>
+      <w:r>
+        <w:t>Бутстрап</w:t>
+      </w:r>
+      <w:proofErr w:type="spellEnd"/>
+      <w:r>
+        <w:t xml:space="preserve"> метод</w:t>
       </w:r>
       <w:r>
         <w:t>.</w:t>
@@ -2116,7 +2267,15 @@
     </w:p>
     <w:p>
       <w:r>
-        <w:t>На основе проведенного анализа с использованием бутстрап-метода были получены следующие результаты по всем метрикам:</w:t>
+        <w:t xml:space="preserve">На основе проведенного анализа с использованием </w:t>
+      </w:r>
+      <w:proofErr w:type="spellStart"/>
+      <w:r>
+        <w:t>бутстрап</w:t>
+      </w:r>
+      <w:proofErr w:type="spellEnd"/>
+      <w:r>
+        <w:t>-метода были получены следующие результаты по всем метрикам:</w:t>
       </w:r>
     </w:p>
     <w:p>
@@ -2126,12 +2285,40 @@
     </w:p>
     <w:p>
       <w:r>
-        <w:t>   - Mobile: p-value = 0.249 (не значимо)</w:t>
-      </w:r>
-    </w:p>
-    <w:p>
-      <w:r>
-        <w:t>   - Desktop: p-value = 0.130 (не значимо)</w:t>
+        <w:t>   - Mobile: p-</w:t>
+      </w:r>
+      <w:proofErr w:type="spellStart"/>
+      <w:r>
+        <w:t>value</w:t>
+      </w:r>
+      <w:proofErr w:type="spellEnd"/>
+      <w:r>
+        <w:t xml:space="preserve"> = 0.</w:t>
+      </w:r>
+      <w:r>
+        <w:t>124</w:t>
+      </w:r>
+      <w:r>
+        <w:t xml:space="preserve"> (не значимо)</w:t>
+      </w:r>
+    </w:p>
+    <w:p>
+      <w:r>
+        <w:t>   - Desktop: p-</w:t>
+      </w:r>
+      <w:proofErr w:type="spellStart"/>
+      <w:r>
+        <w:t>value</w:t>
+      </w:r>
+      <w:proofErr w:type="spellEnd"/>
+      <w:r>
+        <w:t xml:space="preserve"> = 0.</w:t>
+      </w:r>
+      <w:r>
+        <w:t>065</w:t>
+      </w:r>
+      <w:r>
+        <w:t xml:space="preserve"> (не значимо)</w:t>
       </w:r>
     </w:p>
     <w:p>
@@ -2141,12 +2328,37 @@
     </w:p>
     <w:p>
       <w:r>
-        <w:t>   - Разница составляет 18.191 в пользу группы A</w:t>
-      </w:r>
-    </w:p>
-    <w:p>
-      <w:r>
-        <w:t>   - Статистически не значимая разница (p-value &gt; 0.05)</w:t>
+        <w:t>   - Разница составляет 1</w:t>
+      </w:r>
+      <w:r>
+        <w:t>9</w:t>
+      </w:r>
+      <w:r>
+        <w:t>.</w:t>
+      </w:r>
+      <w:r>
+        <w:t>83</w:t>
+      </w:r>
+      <w:r>
+        <w:t xml:space="preserve"> в пользу группы A</w:t>
+      </w:r>
+    </w:p>
+    <w:p>
+      <w:r>
+        <w:t>   - Статистически не значимая разница (p-</w:t>
+      </w:r>
+      <w:proofErr w:type="spellStart"/>
+      <w:proofErr w:type="gramStart"/>
+      <w:r>
+        <w:t>value</w:t>
+      </w:r>
+      <w:proofErr w:type="spellEnd"/>
+      <w:r>
+        <w:t xml:space="preserve"> &gt;</w:t>
+      </w:r>
+      <w:proofErr w:type="gramEnd"/>
+      <w:r>
+        <w:t xml:space="preserve"> 0.05)</w:t>
       </w:r>
     </w:p>
     <w:p>
@@ -2156,12 +2368,31 @@
     </w:p>
     <w:p>
       <w:r>
-        <w:t>   - Разница составляет 0.32 в пользу группы A</w:t>
-      </w:r>
-    </w:p>
-    <w:p>
-      <w:r>
-        <w:t>   - Статистически не значимая разница (p-value &gt; 0.05)</w:t>
+        <w:t>   - Разница составляет 0.3</w:t>
+      </w:r>
+      <w:r>
+        <w:t>1</w:t>
+      </w:r>
+      <w:r>
+        <w:t xml:space="preserve"> в пользу группы A</w:t>
+      </w:r>
+    </w:p>
+    <w:p>
+      <w:r>
+        <w:t>   - Статистически не значимая разница (p-</w:t>
+      </w:r>
+      <w:proofErr w:type="spellStart"/>
+      <w:proofErr w:type="gramStart"/>
+      <w:r>
+        <w:t>value</w:t>
+      </w:r>
+      <w:proofErr w:type="spellEnd"/>
+      <w:r>
+        <w:t xml:space="preserve"> &gt;</w:t>
+      </w:r>
+      <w:proofErr w:type="gramEnd"/>
+      <w:r>
+        <w:t xml:space="preserve"> 0.05)</w:t>
       </w:r>
     </w:p>
     <w:p>
@@ -2172,12 +2403,40 @@
     </w:p>
     <w:p>
       <w:r>
-        <w:t>   - Разница составляет 544.21 секунды (в 3.6 раза выше в группе A)</w:t>
-      </w:r>
-    </w:p>
-    <w:p>
-      <w:r>
-        <w:t>   - Статистически значимая разница (p-value &lt; 0.05)</w:t>
+        <w:t>   - Разница составляет 5</w:t>
+      </w:r>
+      <w:r>
+        <w:t>39</w:t>
+      </w:r>
+      <w:r>
+        <w:t>.</w:t>
+      </w:r>
+      <w:r>
+        <w:t>38</w:t>
+      </w:r>
+      <w:r>
+        <w:t xml:space="preserve"> секунды (в 3.6 раза выше в группе A)</w:t>
+      </w:r>
+    </w:p>
+    <w:p>
+      <w:r>
+        <w:t>   - Статистически значимая разница (p-</w:t>
+      </w:r>
+      <w:proofErr w:type="spellStart"/>
+      <w:r>
+        <w:t>value</w:t>
+      </w:r>
+      <w:proofErr w:type="spellEnd"/>
+      <w:r>
+        <w:t xml:space="preserve"> </w:t>
+      </w:r>
+      <w:proofErr w:type="gramStart"/>
+      <w:r>
+        <w:t>&lt; 0.05</w:t>
+      </w:r>
+      <w:proofErr w:type="gramEnd"/>
+      <w:r>
+        <w:t>)</w:t>
       </w:r>
     </w:p>
     <w:p>
@@ -2192,12 +2451,26 @@
     </w:p>
     <w:p>
       <w:r>
-        <w:t>   - Разница составляет 7.91 страниц в пользу группы A</w:t>
-      </w:r>
-    </w:p>
-    <w:p>
-      <w:r>
-        <w:t>   - p-value = 0.177 (не значимо)</w:t>
+        <w:t>   - Разница составляет 7.</w:t>
+      </w:r>
+      <w:r>
+        <w:t>68</w:t>
+      </w:r>
+      <w:r>
+        <w:t xml:space="preserve"> страниц в пользу группы A</w:t>
+      </w:r>
+    </w:p>
+    <w:p>
+      <w:r>
+        <w:t>   - p-</w:t>
+      </w:r>
+      <w:proofErr w:type="spellStart"/>
+      <w:r>
+        <w:t>value</w:t>
+      </w:r>
+      <w:proofErr w:type="spellEnd"/>
+      <w:r>
+        <w:t xml:space="preserve"> = 0.177 (не значимо)</w:t>
       </w:r>
     </w:p>
     <w:p>
@@ -2207,7 +2480,10 @@
     </w:p>
     <w:p>
       <w:r>
-        <w:t>   - Группа A: RR = 0.44</w:t>
+        <w:t>   - Группа A: RR = 0.4</w:t>
+      </w:r>
+      <w:r>
+        <w:t>3</w:t>
       </w:r>
     </w:p>
     <w:p>
@@ -2217,7 +2493,13 @@
     </w:p>
     <w:p>
       <w:r>
-        <w:t>   - Разница составляет 3 процентных пункта</w:t>
+        <w:t xml:space="preserve">   - Разница составляет </w:t>
+      </w:r>
+      <w:r>
+        <w:t>2</w:t>
+      </w:r>
+      <w:r>
+        <w:t xml:space="preserve"> процентных пункта</w:t>
       </w:r>
     </w:p>
     <w:p>
@@ -2267,8 +2549,13 @@
         <w:lastRenderedPageBreak/>
         <w:t>Рекомендации</w:t>
       </w:r>
-      <w:r>
-        <w:t>: Можно смело обновлять сайт по следующим причинам:</w:t>
+      <w:proofErr w:type="gramStart"/>
+      <w:r>
+        <w:t>: Можно</w:t>
+      </w:r>
+      <w:proofErr w:type="gramEnd"/>
+      <w:r>
+        <w:t xml:space="preserve"> смело обновлять сайт по следующим причинам:</w:t>
       </w:r>
     </w:p>
     <w:p>
@@ -2288,7 +2575,15 @@
     </w:p>
     <w:p>
       <w:r>
-        <w:t>Эти причины демонстрируют, что новый дизайн сайта помогает проще и быстрее ориентироваться на сайте, что позволяет покупать товары быстрее (импульсивная покупка), но из-за этого теряем в среднем чеке и в кол-во, но это статистически не значемые показатели.</w:t>
+        <w:t xml:space="preserve">Эти причины демонстрируют, что новый дизайн сайта помогает проще и быстрее ориентироваться на сайте, что позволяет покупать товары быстрее (импульсивная покупка), но из-за этого теряем в среднем чеке и в кол-во, но это статистически не </w:t>
+      </w:r>
+      <w:proofErr w:type="spellStart"/>
+      <w:r>
+        <w:t>значемые</w:t>
+      </w:r>
+      <w:proofErr w:type="spellEnd"/>
+      <w:r>
+        <w:t xml:space="preserve"> показатели.</w:t>
       </w:r>
     </w:p>
     <w:p>
@@ -2298,17 +2593,19 @@
         </w:rPr>
         <w:t>Вывод</w:t>
       </w:r>
-      <w:r>
-        <w:rPr>
-          <w:color w:val="000000"/>
-        </w:rPr>
-        <w:t xml:space="preserve">: </w:t>
-      </w:r>
-      <w:r>
-        <w:rPr>
-          <w:color w:val="000000"/>
-        </w:rPr>
-        <w:t>Был п</w:t>
+      <w:proofErr w:type="gramStart"/>
+      <w:r>
+        <w:rPr>
+          <w:color w:val="000000"/>
+        </w:rPr>
+        <w:t>: Был</w:t>
+      </w:r>
+      <w:proofErr w:type="gramEnd"/>
+      <w:r>
+        <w:rPr>
+          <w:color w:val="000000"/>
+        </w:rPr>
+        <w:t xml:space="preserve"> п</w:t>
       </w:r>
       <w:r>
         <w:rPr>
@@ -2326,7 +2623,35 @@
         <w:rPr>
           <w:color w:val="000000"/>
         </w:rPr>
-        <w:t xml:space="preserve"> AB-тестирование. По результату расчета значения p-value и построения распределения конверсии, используя бутстрап-метод, </w:t>
+        <w:t xml:space="preserve"> AB-тестирование. По результату расчета значения p-</w:t>
+      </w:r>
+      <w:proofErr w:type="spellStart"/>
+      <w:r>
+        <w:rPr>
+          <w:color w:val="000000"/>
+        </w:rPr>
+        <w:t>value</w:t>
+      </w:r>
+      <w:proofErr w:type="spellEnd"/>
+      <w:r>
+        <w:rPr>
+          <w:color w:val="000000"/>
+        </w:rPr>
+        <w:t xml:space="preserve"> и построения распределения конверсии, используя </w:t>
+      </w:r>
+      <w:proofErr w:type="spellStart"/>
+      <w:r>
+        <w:rPr>
+          <w:color w:val="000000"/>
+        </w:rPr>
+        <w:t>бутстрап</w:t>
+      </w:r>
+      <w:proofErr w:type="spellEnd"/>
+      <w:r>
+        <w:rPr>
+          <w:color w:val="000000"/>
+        </w:rPr>
+        <w:t xml:space="preserve">-метод, </w:t>
       </w:r>
       <w:r>
         <w:rPr>
@@ -2959,6 +3284,7 @@
   <w:style w:type="character" w:default="1" w:styleId="a0">
     <w:name w:val="Default Paragraph Font"/>
     <w:uiPriority w:val="1"/>
+    <w:semiHidden/>
     <w:unhideWhenUsed/>
   </w:style>
   <w:style w:type="table" w:default="1" w:styleId="a1">

</xml_diff>